<commit_message>
feat(jed): expand to full journal length (~5,135 words)
Substantive (non-padding) additions grounded in the existing findings:
- intro: regional AI-strategy timing/urgency + the firm-level measurement gap
- new 2.4: firm-level digital-productivity literature (Bloom et al.,
  Cusolito-Maloney) + positioning the two gaps this paper fills
- new 5.5: relation to prior firm-level evidence (corroborates + extends:
  full-spectrum instrument, regime decomposition, size-invariance)
- renumber 5.5->5.6 Limitations
16-page xelatex PDF, glyph-clean; docx rebuilt. Reaching 6,000+ further
needs the GNI income axis (network-blocked) / sector items (a4a
unreliable), provided as scripts for networked runs.
</commit_message>
<xml_diff>
--- a/jed_ai_digital/jed_digital_divide_manuscript.docx
+++ b/jed_ai_digital/jed_digital_divide_manuscript.docx
@@ -2,7 +2,7 @@
 <file path=word/document.xml><?xml version="1.0" encoding="utf-8"?>
 <w:document xmlns:w="http://schemas.openxmlformats.org/wordprocessingml/2006/main" xmlns:m="http://schemas.openxmlformats.org/officeDocument/2006/math" xmlns:r="http://schemas.openxmlformats.org/officeDocument/2006/relationships" xmlns:o="urn:schemas-microsoft-com:office:office" xmlns:v="urn:schemas-microsoft-com:vml" xmlns:w10="urn:schemas-microsoft-com:office:word" xmlns:a="http://schemas.openxmlformats.org/drawingml/2006/main" xmlns:pic="http://schemas.openxmlformats.org/drawingml/2006/picture" xmlns:wp="http://schemas.openxmlformats.org/drawingml/2006/wordprocessingDrawing">
   <w:body>
-    <w:bookmarkStart w:id="44" w:name="X59214c1059dc6e4cdb8535989c20119096aff4a"/>
+    <w:bookmarkStart w:id="46" w:name="X59214c1059dc6e4cdb8535989c20119096aff4a"/>
     <w:p>
       <w:pPr>
         <w:pStyle w:val="Heading1"/>
@@ -221,6 +221,14 @@
         <w:pStyle w:val="BodyText"/>
       </w:pPr>
       <w:r>
+        <w:t xml:space="preserve">The timing gives the question added urgency. Across the Asia-Pacific region, governments are racing to publish national AI strategies, stand up AI compute capacity, and pilot public-sector AI — a frontier-facing agenda premised on a firm population able to act on it. Whether that premise holds is an empirical matter that has gone largely unmeasured at the firm level. If the marginal developing-economy firm has not yet established even a basic online presence, then a national pivot to AI risks delivering its benefits to a thin layer of already-digital firms while leaving the broad base behind, converting a development opportunity into a fresh source of divergence. Establishing where firms actually stand on the digital ladder, and what the next rung is worth, is therefore a precondition for evidence-based AI-and-development policy, not a separable technical exercise.</w:t>
+      </w:r>
+    </w:p>
+    <w:p>
+      <w:pPr>
+        <w:pStyle w:val="BodyText"/>
+      </w:pPr>
+      <w:r>
         <w:t xml:space="preserve">We exploit that opportunity. Drawing on harmonised WBES microdata for 88,869 firms across 50 Asian and Pacific economies (2003–2025, including Japan's inaugural 2025 wave), we measure basic digital adoption (establishment web presence) and firm labour productivity, classify economies into six institutional regimes, and ask three questions. How large is the firm-level digital divide across institutional regimes? What is the productivity dividend of basic digital adoption, and does it vary by regime? And what do these patterns imply for the distribution of AI-era growth?</w:t>
       </w:r>
     </w:p>
@@ -233,7 +241,7 @@
       </w:r>
     </w:p>
     <w:bookmarkEnd w:id="21"/>
-    <w:bookmarkStart w:id="25" w:name="X7e996bad10ec7a91eb2c41b96700da8571e962e"/>
+    <w:bookmarkStart w:id="26" w:name="X7e996bad10ec7a91eb2c41b96700da8571e962e"/>
     <w:p>
       <w:pPr>
         <w:pStyle w:val="Heading2"/>
@@ -454,23 +462,13 @@
       </w:r>
     </w:p>
     <w:bookmarkEnd w:id="24"/>
-    <w:bookmarkEnd w:id="25"/>
-    <w:bookmarkStart w:id="29" w:name="X5eb800a903106e48a684e9ea9de39ed619b9df8"/>
-    <w:p>
-      <w:pPr>
-        <w:pStyle w:val="Heading2"/>
-      </w:pPr>
-      <w:r>
-        <w:t xml:space="preserve">3. Data and methods</w:t>
-      </w:r>
-    </w:p>
-    <w:bookmarkStart w:id="26" w:name="X7539fb3dc2f98232f41138bc75cab658563f4ee"/>
+    <w:bookmarkStart w:id="25" w:name="X52b642030a5b72b6bf74e24cfafcddecd1296ac"/>
     <w:p>
       <w:pPr>
         <w:pStyle w:val="Heading3"/>
       </w:pPr>
       <w:r>
-        <w:t xml:space="preserve">3.1 Data</w:t>
+        <w:t xml:space="preserve">2.4 Firm-level evidence and the present contribution</w:t>
       </w:r>
     </w:p>
     <w:p>
@@ -478,99 +476,183 @@
         <w:pStyle w:val="FirstParagraph"/>
       </w:pPr>
       <w:r>
-        <w:t xml:space="preserve">We use harmonised WBES microdata for 50 Asian and Pacific economies across 103 economy-year waves, 2003–2025, an analytic frame of 88,869 firms that includes Japan's inaugural 2025 wave. The WBES is administered face-to-face to a senior manager or owner on a standardised instrument, with harmonised sampling and variable definitions that permit direct comparison across the institutional spectrum. The harmonisation of the multi-economy pool (questionnaire-generation mapping, currency comparability, and pooled cross-section construction) follows the protocol documented in the parent dissertation programme.</w:t>
-      </w:r>
-    </w:p>
-    <w:p>
-      <w:pPr>
-        <w:pStyle w:val="BodyText"/>
-      </w:pPr>
-      <w:r>
-        <w:t xml:space="preserve">The six institutional regimes also approximate an income-development gradient, which is what makes the comparison relevant to the development agenda. The advanced innovation-driven regime (I) and the advanced resource-driven regime (II) are predominantly high-income economies; the upper-middle regime (III) and the lower-middle transition regime (IV) span the upper- and lower-middle-income brackets that contain the bulk of the region's population and firms; and the emerging (V) and Pacific-SIDS (VI) regimes concentrate the lower-middle- and low-income economies, including several of the most aid-dependent states in the region. The institutional classification and the income classification are therefore largely co-linear, so the cross-regime patterns documented below can be read interchangeably as institutional or developmental gradients. A firm-weighted cross-economy correlation between web adoption and GNI per capita would sharpen this mapping; because the working environment blocks access to the World Bank indicators API, that step is provided as a replication script (</w:t>
-      </w:r>
-      <w:r>
-        <w:rPr>
-          <w:rStyle w:val="VerbatimChar"/>
-        </w:rPr>
-        <w:t xml:space="preserve">jed_ai_digital/replication/jed_gni_axis.py</w:t>
-      </w:r>
-      <w:r>
-        <w:t xml:space="preserve">) to be run on a networked machine, and we rely on the institutional regime as the development proxy in the estimates that follow.</w:t>
-      </w:r>
-    </w:p>
-    <w:bookmarkEnd w:id="26"/>
-    <w:bookmarkStart w:id="27" w:name="Xbcf9f12e79107fa2c089aaf13fc6c4fb773f1c2"/>
-    <w:p>
-      <w:pPr>
-        <w:pStyle w:val="Heading3"/>
-      </w:pPr>
-      <w:r>
-        <w:t xml:space="preserve">3.2 Variables</w:t>
-      </w:r>
-    </w:p>
-    <w:p>
-      <w:pPr>
-        <w:pStyle w:val="FirstParagraph"/>
-      </w:pPr>
+        <w:t xml:space="preserve">A substantial firm-level literature links information and communication technology to productivity, but it is concentrated in advanced economies and rarely spans the institutional range that the development question requires. Studies of US and European firms find sizeable returns to ICT and to the organisational changes that complement it (Bloom, Garicano, Sadun, &amp; Van Reenen, 2014; Brynjolfsson et al., 2021), while firm-level work in developing economies — much of it drawing on the WBES — documents that connectivity, electricity reliability, and basic digital tools are associated with higher productivity and a greater propensity to export, yet that adoption is itself stratified by firm size, formality, and location (Cusolito &amp; Maloney, 2018). Two gaps remain. First, the evidence is fragmented across single-country or single-region studies that use different instruments, making the cross-institutional comparison that development policy needs impossible to assemble. Second, the literature has rarely asked whether the</w:t>
+      </w:r>
+      <w:r>
+        <w:t xml:space="preserve"> </w:t>
+      </w:r>
       <w:r>
         <w:rPr>
           <w:iCs/>
           <w:i/>
         </w:rPr>
-        <w:t xml:space="preserve">Digital adoption (DAI).</w:t>
-      </w:r>
-      <w:r>
-        <w:t xml:space="preserve"> </w:t>
-      </w:r>
-      <w:r>
-        <w:t xml:space="preserve">A binary indicator of establishment web presence (WBES item c22b), the Tier-1 marker of digital participation.</w:t>
-      </w:r>
-    </w:p>
-    <w:p>
-      <w:pPr>
-        <w:pStyle w:val="BodyText"/>
-      </w:pPr>
+        <w:t xml:space="preserve">return</w:t>
+      </w:r>
+      <w:r>
+        <w:t xml:space="preserve"> </w:t>
+      </w:r>
+      <w:r>
+        <w:t xml:space="preserve">to basic digital adoption — as distinct from its</w:t>
+      </w:r>
+      <w:r>
+        <w:t xml:space="preserve"> </w:t>
+      </w:r>
       <w:r>
         <w:rPr>
           <w:iCs/>
           <w:i/>
         </w:rPr>
-        <w:t xml:space="preserve">Labour productivity.</w:t>
-      </w:r>
-      <w:r>
-        <w:t xml:space="preserve"> </w:t>
-      </w:r>
-      <w:r>
-        <w:t xml:space="preserve">Log annual sales per permanent worker, winsorised at the 1st/99th percentiles within wave and standardised within each economy-year cell (lp_z). Within-cell standardisation removes the nominal-currency and price-level differences that would otherwise contaminate cross-economy productivity comparison, so the relationship is identified from within-cell variation.</w:t>
-      </w:r>
-    </w:p>
-    <w:p>
-      <w:pPr>
-        <w:pStyle w:val="BodyText"/>
-      </w:pPr>
+        <w:t xml:space="preserve">level</w:t>
+      </w:r>
+      <w:r>
+        <w:t xml:space="preserve"> </w:t>
+      </w:r>
+      <w:r>
+        <w:t xml:space="preserve">— varies systematically across the institutional gradient, which is precisely the question that determines where the marginal digital-policy dollar should go.</w:t>
+      </w:r>
+    </w:p>
+    <w:p>
+      <w:pPr>
+        <w:pStyle w:val="BodyText"/>
+      </w:pPr>
+      <w:r>
+        <w:t xml:space="preserve">The present study addresses both gaps with a single harmonised instrument spanning the full institutional spectrum, and frames the result explicitly as the</w:t>
+      </w:r>
+      <w:r>
+        <w:t xml:space="preserve"> </w:t>
+      </w:r>
       <w:r>
         <w:rPr>
           <w:iCs/>
           <w:i/>
         </w:rPr>
-        <w:t xml:space="preserve">Technological capability (TCI).</w:t>
-      </w:r>
-      <w:r>
-        <w:t xml:space="preserve"> </w:t>
-      </w:r>
-      <w:r>
-        <w:t xml:space="preserve">The standardised mean of R&amp;D activity (h8) and internationally recognised quality certification (b8), included as a benchmark "deep" capability against which to compare the "surface" digital indicator.</w:t>
-      </w:r>
-    </w:p>
-    <w:p>
-      <w:pPr>
-        <w:pStyle w:val="BodyText"/>
+        <w:t xml:space="preserve">pre-AI</w:t>
+      </w:r>
+      <w:r>
+        <w:t xml:space="preserve"> </w:t>
+      </w:r>
+      <w:r>
+        <w:t xml:space="preserve">substrate question. In doing so it connects three conversations that usually proceed separately: the digital-divide literature's concern with unequal access, the productivity literature's concern with complementary capabilities, and the AI-and-development debate's concern with distribution. The contribution is intentionally foundational rather than frontier: by pricing the most basic digital step across fifty economies, it establishes a lower bound on what the AI era inherits.</w:t>
+      </w:r>
+    </w:p>
+    <w:bookmarkEnd w:id="25"/>
+    <w:bookmarkEnd w:id="26"/>
+    <w:bookmarkStart w:id="30" w:name="X5eb800a903106e48a684e9ea9de39ed619b9df8"/>
+    <w:p>
+      <w:pPr>
+        <w:pStyle w:val="Heading2"/>
+      </w:pPr>
+      <w:r>
+        <w:t xml:space="preserve">3. Data and methods</w:t>
+      </w:r>
+    </w:p>
+    <w:bookmarkStart w:id="27" w:name="X7539fb3dc2f98232f41138bc75cab658563f4ee"/>
+    <w:p>
+      <w:pPr>
+        <w:pStyle w:val="Heading3"/>
+      </w:pPr>
+      <w:r>
+        <w:t xml:space="preserve">3.1 Data</w:t>
+      </w:r>
+    </w:p>
+    <w:p>
+      <w:pPr>
+        <w:pStyle w:val="FirstParagraph"/>
+      </w:pPr>
+      <w:r>
+        <w:t xml:space="preserve">We use harmonised WBES microdata for 50 Asian and Pacific economies across 103 economy-year waves, 2003–2025, an analytic frame of 88,869 firms that includes Japan's inaugural 2025 wave. The WBES is administered face-to-face to a senior manager or owner on a standardised instrument, with harmonised sampling and variable definitions that permit direct comparison across the institutional spectrum. The harmonisation of the multi-economy pool (questionnaire-generation mapping, currency comparability, and pooled cross-section construction) follows the protocol documented in the parent dissertation programme.</w:t>
+      </w:r>
+    </w:p>
+    <w:p>
+      <w:pPr>
+        <w:pStyle w:val="BodyText"/>
+      </w:pPr>
+      <w:r>
+        <w:t xml:space="preserve">The six institutional regimes also approximate an income-development gradient, which is what makes the comparison relevant to the development agenda. The advanced innovation-driven regime (I) and the advanced resource-driven regime (II) are predominantly high-income economies; the upper-middle regime (III) and the lower-middle transition regime (IV) span the upper- and lower-middle-income brackets that contain the bulk of the region's population and firms; and the emerging (V) and Pacific-SIDS (VI) regimes concentrate the lower-middle- and low-income economies, including several of the most aid-dependent states in the region. The institutional classification and the income classification are therefore largely co-linear, so the cross-regime patterns documented below can be read interchangeably as institutional or developmental gradients. A firm-weighted cross-economy correlation between web adoption and GNI per capita would sharpen this mapping; because the working environment blocks access to the World Bank indicators API, that step is provided as a replication script (</w:t>
+      </w:r>
+      <w:r>
+        <w:rPr>
+          <w:rStyle w:val="VerbatimChar"/>
+        </w:rPr>
+        <w:t xml:space="preserve">jed_ai_digital/replication/jed_gni_axis.py</w:t>
+      </w:r>
+      <w:r>
+        <w:t xml:space="preserve">) to be run on a networked machine, and we rely on the institutional regime as the development proxy in the estimates that follow.</w:t>
+      </w:r>
+    </w:p>
+    <w:bookmarkEnd w:id="27"/>
+    <w:bookmarkStart w:id="28" w:name="Xbcf9f12e79107fa2c089aaf13fc6c4fb773f1c2"/>
+    <w:p>
+      <w:pPr>
+        <w:pStyle w:val="Heading3"/>
+      </w:pPr>
+      <w:r>
+        <w:t xml:space="preserve">3.2 Variables</w:t>
+      </w:r>
+    </w:p>
+    <w:p>
+      <w:pPr>
+        <w:pStyle w:val="FirstParagraph"/>
       </w:pPr>
       <w:r>
         <w:rPr>
           <w:iCs/>
           <w:i/>
         </w:rPr>
+        <w:t xml:space="preserve">Digital adoption (DAI).</w:t>
+      </w:r>
+      <w:r>
+        <w:t xml:space="preserve"> </w:t>
+      </w:r>
+      <w:r>
+        <w:t xml:space="preserve">A binary indicator of establishment web presence (WBES item c22b), the Tier-1 marker of digital participation.</w:t>
+      </w:r>
+    </w:p>
+    <w:p>
+      <w:pPr>
+        <w:pStyle w:val="BodyText"/>
+      </w:pPr>
+      <w:r>
+        <w:rPr>
+          <w:iCs/>
+          <w:i/>
+        </w:rPr>
+        <w:t xml:space="preserve">Labour productivity.</w:t>
+      </w:r>
+      <w:r>
+        <w:t xml:space="preserve"> </w:t>
+      </w:r>
+      <w:r>
+        <w:t xml:space="preserve">Log annual sales per permanent worker, winsorised at the 1st/99th percentiles within wave and standardised within each economy-year cell (lp_z). Within-cell standardisation removes the nominal-currency and price-level differences that would otherwise contaminate cross-economy productivity comparison, so the relationship is identified from within-cell variation.</w:t>
+      </w:r>
+    </w:p>
+    <w:p>
+      <w:pPr>
+        <w:pStyle w:val="BodyText"/>
+      </w:pPr>
+      <w:r>
+        <w:rPr>
+          <w:iCs/>
+          <w:i/>
+        </w:rPr>
+        <w:t xml:space="preserve">Technological capability (TCI).</w:t>
+      </w:r>
+      <w:r>
+        <w:t xml:space="preserve"> </w:t>
+      </w:r>
+      <w:r>
+        <w:t xml:space="preserve">The standardised mean of R&amp;D activity (h8) and internationally recognised quality certification (b8), included as a benchmark "deep" capability against which to compare the "surface" digital indicator.</w:t>
+      </w:r>
+    </w:p>
+    <w:p>
+      <w:pPr>
+        <w:pStyle w:val="BodyText"/>
+      </w:pPr>
+      <w:r>
+        <w:rPr>
+          <w:iCs/>
+          <w:i/>
+        </w:rPr>
         <w:t xml:space="preserve">Institutional regime (ICRV).</w:t>
       </w:r>
       <w:r>
@@ -580,8 +662,8 @@
         <w:t xml:space="preserve">Each economy is assigned to one of six Institutional Context Regime Variation groups, ordered from strongest to weakest institutional and resource conditions: I Advanced innovation-driven (including Japan, Korea, Singapore, Taiwan, Hong Kong SAR, Israel); II Advanced resource-driven (Gulf economies); III Upper-middle; IV Lower-middle transition; V Emerging; VI Pacific Small Island Developing States.</w:t>
       </w:r>
     </w:p>
-    <w:bookmarkEnd w:id="27"/>
-    <w:bookmarkStart w:id="28" w:name="Xaf7eb2307f7939a5e28c8df2b6899314ed6f398"/>
+    <w:bookmarkEnd w:id="28"/>
+    <w:bookmarkStart w:id="29" w:name="Xaf7eb2307f7939a5e28c8df2b6899314ed6f398"/>
     <w:p>
       <w:pPr>
         <w:pStyle w:val="Heading3"/>
@@ -610,9 +692,9 @@
         <w:t xml:space="preserve">; because the working environment lacks a Stata licence, estimation uses the reghdfe-equivalent pyfixest, to be re-validated in Stata before submission.</w:t>
       </w:r>
     </w:p>
-    <w:bookmarkEnd w:id="28"/>
     <w:bookmarkEnd w:id="29"/>
-    <w:bookmarkStart w:id="35" w:name="X121719332867ee227f0a04b486098cee978c6e6"/>
+    <w:bookmarkEnd w:id="30"/>
+    <w:bookmarkStart w:id="36" w:name="X121719332867ee227f0a04b486098cee978c6e6"/>
     <w:p>
       <w:pPr>
         <w:pStyle w:val="Heading2"/>
@@ -621,7 +703,7 @@
         <w:t xml:space="preserve">4. Results</w:t>
       </w:r>
     </w:p>
-    <w:bookmarkStart w:id="30" w:name="X947ea78f059fd1164ac6057539f896d68f3a17b"/>
+    <w:bookmarkStart w:id="31" w:name="X947ea78f059fd1164ac6057539f896d68f3a17b"/>
     <w:p>
       <w:pPr>
         <w:pStyle w:val="Heading3"/>
@@ -1004,8 +1086,8 @@
         <w:t xml:space="preserve">The divide is closing, but slowly. Pooling across all economies, web adoption rose from 32.6% in the 2003–2009 waves to 44.6% in 2010–2015 and 52.3% in 2016–2025. Even in the most recent window, then, barely more than half of the region's formal-sector firms maintain a web presence — a sobering baseline against which to assess the readiness of the firm population to absorb AI tools that presuppose an online operating footprint.</w:t>
       </w:r>
     </w:p>
-    <w:bookmarkEnd w:id="30"/>
-    <w:bookmarkStart w:id="31" w:name="X002c2c8bb56840f8b864ead84512a5a3903d5ea"/>
+    <w:bookmarkEnd w:id="31"/>
+    <w:bookmarkStart w:id="32" w:name="X002c2c8bb56840f8b864ead84512a5a3903d5ea"/>
     <w:p>
       <w:pPr>
         <w:pStyle w:val="Heading3"/>
@@ -1469,8 +1551,8 @@
         <w:t xml:space="preserve">The premium is non-monotonic in institutional strength. It is compressed in the two highest-adoption regimes — advanced-innovation (+0.240, adoption 69%) and upper-middle (+0.214, adoption 54%) — and largest in the catching-up regimes, lower-middle transition (+0.383) and advanced-resource (+0.477), where adoption is partial and still differentiating. This pattern is consistent with digital saturation: where web presence is near-universal, the indicator weakly discriminates and the marginal premium shrinks. We are cautious, however, in calling this a confirmed law. A formal test correlating each regime's adoption rate with its premium across the six regimes is negative but far from significant (Pearson r = −0.13, p = .80; Table 4), because the advanced-resource regime combines middling adoption (50%) with the largest premium, breaking a clean monotone. The defensible claim is narrower: the marginal productivity value of crossing the basic-digital threshold is compressed at the saturated frontier and substantial in the mid-transition economies, but adoption level alone does not fully order the premium.</w:t>
       </w:r>
     </w:p>
-    <w:bookmarkEnd w:id="31"/>
-    <w:bookmarkStart w:id="32" w:name="X21fab24d61e21ca97f151ddbbf430f9b408058c"/>
+    <w:bookmarkEnd w:id="32"/>
+    <w:bookmarkStart w:id="33" w:name="X21fab24d61e21ca97f151ddbbf430f9b408058c"/>
     <w:p>
       <w:pPr>
         <w:pStyle w:val="Heading3"/>
@@ -1635,8 +1717,8 @@
         </w:tc>
       </w:tr>
     </w:tbl>
-    <w:bookmarkEnd w:id="32"/>
-    <w:bookmarkStart w:id="33" w:name="X7c95bb97131b594aa7673109c051c80c5a0bcc4"/>
+    <w:bookmarkEnd w:id="33"/>
+    <w:bookmarkStart w:id="34" w:name="X7c95bb97131b594aa7673109c051c80c5a0bcc4"/>
     <w:p>
       <w:pPr>
         <w:pStyle w:val="Heading3"/>
@@ -1992,8 +2074,8 @@
         </w:tc>
       </w:tr>
     </w:tbl>
-    <w:bookmarkEnd w:id="33"/>
-    <w:bookmarkStart w:id="34" w:name="X1754dfea9198afb053861d6ba03a4a301265122"/>
+    <w:bookmarkEnd w:id="34"/>
+    <w:bookmarkStart w:id="35" w:name="X1754dfea9198afb053861d6ba03a4a301265122"/>
     <w:p>
       <w:pPr>
         <w:pStyle w:val="Heading3"/>
@@ -2010,9 +2092,9 @@
         <w:t xml:space="preserve">A natural concern is that the digital dividend accrues mainly to large firms with the resources to exploit an online presence, in which case digitalisation policy would be regressive within economies. The data do not support this concern. Interacting digital adoption with firm size (log employment, standardised), the interaction term is small and not significant (−0.024, p = .48), while the main digital effect remains positive and significant (+0.189, p &lt; .001). The point estimate, if anything, leans toward smaller firms gaining slightly more, but the safe reading is that the digital dividend is broadly uniform across the firm-size distribution. Basic digitalisation is thus a candidate for inclusive productivity policy: it raises the productivity of small and large firms alike, rather than concentrating gains at the top of the size distribution.</w:t>
       </w:r>
     </w:p>
-    <w:bookmarkEnd w:id="34"/>
     <w:bookmarkEnd w:id="35"/>
-    <w:bookmarkStart w:id="41" w:name="X735612638e4e736e4693e459c258977262c0dfc"/>
+    <w:bookmarkEnd w:id="36"/>
+    <w:bookmarkStart w:id="43" w:name="X735612638e4e736e4693e459c258977262c0dfc"/>
     <w:p>
       <w:pPr>
         <w:pStyle w:val="Heading2"/>
@@ -2021,7 +2103,7 @@
         <w:t xml:space="preserve">5. Discussion</w:t>
       </w:r>
     </w:p>
-    <w:bookmarkStart w:id="36" w:name="X1e60fac1e5ba6e499efcca0e0df5dfcb20252ad"/>
+    <w:bookmarkStart w:id="37" w:name="X1e60fac1e5ba6e499efcca0e0df5dfcb20252ad"/>
     <w:p>
       <w:pPr>
         <w:pStyle w:val="Heading3"/>
@@ -2038,8 +2120,8 @@
         <w:t xml:space="preserve">The three findings combine into a single development message. The economies furthest behind on basic digital adoption (emerging, SIDS) still earn a significant productivity dividend from crossing the digital threshold — closing their divide is worth real output. Yet these are precisely the economies least equipped to absorb the AI tools that the policy conversation now foregrounds. AI sits at the top of a capability ladder whose bottom rung — basic web presence — half the region's firms have not yet reached. An AI agenda that ignores this sequencing risks delivering its dividends only to the frontier firms and economies that have already climbed the lower rungs, widening rather than narrowing cross-economy inequality (Acemoglu &amp; Restrepo, 2020; Korinek &amp; Stiglitz, 2021). The pre-AI digital divide is, in this sense, the leading edge of the AI-era divide.</w:t>
       </w:r>
     </w:p>
-    <w:bookmarkEnd w:id="36"/>
-    <w:bookmarkStart w:id="37" w:name="X43bfcbb6d5783b69e1668efb2b2820a03e16f3e"/>
+    <w:bookmarkEnd w:id="37"/>
+    <w:bookmarkStart w:id="38" w:name="X43bfcbb6d5783b69e1668efb2b2820a03e16f3e"/>
     <w:p>
       <w:pPr>
         <w:pStyle w:val="Heading3"/>
@@ -2056,8 +2138,8 @@
         <w:t xml:space="preserve">The non-monotonic premium has a corollary for policy targeting. In the advanced-innovation regime, where adoption is near-saturation, the marginal productivity return to pushing the last firms online is comparatively small (+0.240) — the frontier's digital agenda must move up the ladder toward AI and advanced analytics. In the catching-up regimes, by contrast, the marginal return to basic digitalisation is largest (+0.38 to +0.48), so the highest-yield digital policy in transition economies is still basic enablement, not frontier AI. Development strategy should therefore be regime-contingent: basic-digital enablement where adoption is partial, AI-readiness investment where it is saturated. A uniform "adopt AI" prescription misallocates effort across the institutional gradient.</w:t>
       </w:r>
     </w:p>
-    <w:bookmarkEnd w:id="37"/>
-    <w:bookmarkStart w:id="38" w:name="X71f50b71bd5f142d567b38466b82285236969ff"/>
+    <w:bookmarkEnd w:id="38"/>
+    <w:bookmarkStart w:id="39" w:name="X71f50b71bd5f142d567b38466b82285236969ff"/>
     <w:p>
       <w:pPr>
         <w:pStyle w:val="Heading3"/>
@@ -2074,8 +2156,8 @@
         <w:t xml:space="preserve">Because labour productivity is the proximate driver of wages and firm survival, the digital dividend documented here is also a welfare channel. In the catching-up and emerging regimes that contain the bulk of the region's employment, a productivity premium of a quarter to nearly half a standard deviation from basic digital adoption is economically large. Policies that lower the cost of firm digitalisation — affordable connectivity, digital-payment rails, simplified online business registration — therefore have a plausible claim to be pro-poor productivity policy, not merely modernisation for its own sake. The welfare case for closing the digital divide does not depend on AI arriving; it is already justified by the pre-AI dividend, and AI raises, rather than creates, the stakes.</w:t>
       </w:r>
     </w:p>
-    <w:bookmarkEnd w:id="38"/>
-    <w:bookmarkStart w:id="39" w:name="X879379bf950dcd630f87e487bf189e34ca7b97d"/>
+    <w:bookmarkEnd w:id="39"/>
+    <w:bookmarkStart w:id="40" w:name="X879379bf950dcd630f87e487bf189e34ca7b97d"/>
     <w:p>
       <w:pPr>
         <w:pStyle w:val="Heading3"/>
@@ -2100,14 +2182,14 @@
         <w:t xml:space="preserve">This sequencing argument is also the paper's principal contribution to the AI-and-development debate. Where that debate has largely proceeded by forecasting AI's prospective effects, we ground it in a measured precondition: the existing, observable distribution of the digital substrate on which any AI dividend must build. The contribution is deliberately modest in its empirical claim — basic web presence is a coarse proxy and the design is associational — but it is precisely the modesty that makes the policy implication robust. One does not need to resolve the contested forecasts about AI's frontier effects to conclude that an economy in which half of firms are offline is not positioned to capture them.</w:t>
       </w:r>
     </w:p>
-    <w:bookmarkEnd w:id="39"/>
-    <w:bookmarkStart w:id="40" w:name="Xde7edcb3f604b7ff7a62d585547252a5b42f172"/>
+    <w:bookmarkEnd w:id="40"/>
+    <w:bookmarkStart w:id="41" w:name="X09eed8111aa40e5a225645ca236bdb705fbdfe4"/>
     <w:p>
       <w:pPr>
         <w:pStyle w:val="Heading3"/>
       </w:pPr>
       <w:r>
-        <w:t xml:space="preserve">5.5 Limitations</w:t>
+        <w:t xml:space="preserve">5.5 Relation to prior firm-level evidence</w:t>
       </w:r>
     </w:p>
     <w:p>
@@ -2115,52 +2197,7 @@
         <w:pStyle w:val="FirstParagraph"/>
       </w:pPr>
       <w:r>
-        <w:t xml:space="preserve">Three limitations bound the interpretation. First, the WBES is a repeated cross-section, not a panel; the estimates are within-economy-year associations conditioned on fixed effects, not causal effects, and selection of more productive firms into digital adoption is part of what they reflect. Second, web presence is a coarse, binary Tier-1 proxy; it captures the existence but not the depth or quality of digital engagement, and it does not measure AI adoption directly — by design, since our claim concerns the pre-AI substrate. Third, the cross-economy comparison rests on within-economy-year standardisation of productivity; level comparisons of raw productivity across economies are not identified and are not attempted here. Subsequent WBES waves carrying richer digital-capability items will allow the analysis to climb the digital ladder toward the AI rung itself.</w:t>
-      </w:r>
-    </w:p>
-    <w:bookmarkEnd w:id="40"/>
-    <w:bookmarkEnd w:id="41"/>
-    <w:bookmarkStart w:id="42" w:name="X6b297cc947e0db5526be369b1f0f4ddc67b2415"/>
-    <w:p>
-      <w:pPr>
-        <w:pStyle w:val="Heading2"/>
-      </w:pPr>
-      <w:r>
-        <w:t xml:space="preserve">6. Conclusion</w:t>
-      </w:r>
-    </w:p>
-    <w:p>
-      <w:pPr>
-        <w:pStyle w:val="FirstParagraph"/>
-      </w:pPr>
-      <w:r>
-        <w:t xml:space="preserve">Across 50 Asian and Pacific economies, barely half of formal-sector firms have crossed the most basic digital threshold, and the gap between the strongest and weakest institutional regimes is roughly 28 percentage points. The productivity dividend from closing that gap is real in every regime and largest in the catching-up economies that are mid-transition. Yet these economies — the ones with the most to gain from basic digitalisation — are the least equipped to absorb the AI tools now dominating the development conversation. The implication for the age of AI is direct: sustainable, broadly shared growth from AI presupposes a digital substrate that does not yet exist for half the region's firms. Closing the pre-AI digital divide is the precondition for AI to narrow rather than widen development inequality, and the firm-level evidence shows that closing it pays — most of all where the gap is widest.</w:t>
-      </w:r>
-    </w:p>
-    <w:p>
-      <w:pPr>
-        <w:pStyle w:val="BodyText"/>
-      </w:pPr>
-      <w:r>
-        <w:t xml:space="preserve">These conclusions invite three lines of further work. First, the binary web-presence indicator should be extended up the digital ladder: more recent WBES waves carry richer items — e-commerce, digital payments, and eventually AI-tool use — that would let the analysis trace the dividend from basic presence through to AI adoption itself, testing whether the saturation pattern recurs at each rung. Second, the associational design should be sharpened where instruments are available; staggered national broadband and digital-ID rollouts offer plausible sources of exogenous variation in firm digital adoption that a panel extension of the WBES could exploit. Third, the income-development axis should be made explicit by merging the firm-level adoption rates with national GNI and digital-infrastructure indicators (the replication script accompanying this paper performs the merge once networked access is available), allowing the divide to be priced against the macro development gradient rather than the institutional proxy used here. None of these extensions, however, overturns the core message: in an era preoccupied with the frontier, the binding development constraint for most firms remains the first digital step — and that step, the evidence shows, already pays.</w:t>
-      </w:r>
-    </w:p>
-    <w:bookmarkEnd w:id="42"/>
-    <w:bookmarkStart w:id="43" w:name="references"/>
-    <w:p>
-      <w:pPr>
-        <w:pStyle w:val="Heading2"/>
-      </w:pPr>
-      <w:r>
-        <w:t xml:space="preserve">References</w:t>
-      </w:r>
-    </w:p>
-    <w:p>
-      <w:pPr>
-        <w:pStyle w:val="FirstParagraph"/>
-      </w:pPr>
-      <w:r>
-        <w:t xml:space="preserve">Acemoglu, D., &amp; Restrepo, P. (2020). Robots and jobs: Evidence from US labor markets.</w:t>
+        <w:t xml:space="preserve">The results both corroborate and extend the firm-level digital-productivity literature. They corroborate it in the basic fact that web presence is associated with materially higher productivity, consistent with advanced-economy ICT studies and with WBES-based developing-economy work. They extend it in three ways. First, by estimating the premium on a single harmonised instrument across the full institutional spectrum, they show the association is not an artefact of any one economy or income level: it holds in all six regimes, from the advanced-innovation frontier to the Pacific small islands. Second, by decomposing the premium by regime, they reveal a pattern the single-country literature could not see — that the return to the basic digital step is compressed at the saturated frontier and largest in the catching-up middle, so the marginal value of digital policy is regime-specific rather than uniform. Third, by showing the dividend is broadly invariant to firm size, they qualify the common presumption that digitalisation favours large incumbents; in this firm population, the basic-digital return reaches small and large firms alike. Against the prior literature, then, the distinctive claim of this paper is not that digital adoption matters — that is established — but that</w:t>
       </w:r>
       <w:r>
         <w:t xml:space="preserve"> </w:t>
@@ -2170,18 +2207,76 @@
           <w:iCs/>
           <w:i/>
         </w:rPr>
-        <w:t xml:space="preserve">Journal of Political Economy, 128</w:t>
-      </w:r>
-      <w:r>
-        <w:t xml:space="preserve">(6), 2188–2244.</w:t>
-      </w:r>
-    </w:p>
-    <w:p>
-      <w:pPr>
-        <w:pStyle w:val="BodyText"/>
-      </w:pPr>
-      <w:r>
-        <w:t xml:space="preserve">Agrawal, A., Gans, J., &amp; Goldfarb, A. (2019).</w:t>
+        <w:t xml:space="preserve">where it matters most</w:t>
+      </w:r>
+      <w:r>
+        <w:t xml:space="preserve"> </w:t>
+      </w:r>
+      <w:r>
+        <w:t xml:space="preserve">is the catching-up economies that the AI conversation is at risk of bypassing.</w:t>
+      </w:r>
+    </w:p>
+    <w:bookmarkEnd w:id="41"/>
+    <w:bookmarkStart w:id="42" w:name="X268c916b26bbeb1e0111743927fd75743ff83ab"/>
+    <w:p>
+      <w:pPr>
+        <w:pStyle w:val="Heading3"/>
+      </w:pPr>
+      <w:r>
+        <w:t xml:space="preserve">5.6 Limitations</w:t>
+      </w:r>
+    </w:p>
+    <w:p>
+      <w:pPr>
+        <w:pStyle w:val="FirstParagraph"/>
+      </w:pPr>
+      <w:r>
+        <w:t xml:space="preserve">Three limitations bound the interpretation. First, the WBES is a repeated cross-section, not a panel; the estimates are within-economy-year associations conditioned on fixed effects, not causal effects, and selection of more productive firms into digital adoption is part of what they reflect. Second, web presence is a coarse, binary Tier-1 proxy; it captures the existence but not the depth or quality of digital engagement, and it does not measure AI adoption directly — by design, since our claim concerns the pre-AI substrate. Third, the cross-economy comparison rests on within-economy-year standardisation of productivity; level comparisons of raw productivity across economies are not identified and are not attempted here. Subsequent WBES waves carrying richer digital-capability items will allow the analysis to climb the digital ladder toward the AI rung itself.</w:t>
+      </w:r>
+    </w:p>
+    <w:bookmarkEnd w:id="42"/>
+    <w:bookmarkEnd w:id="43"/>
+    <w:bookmarkStart w:id="44" w:name="X6b297cc947e0db5526be369b1f0f4ddc67b2415"/>
+    <w:p>
+      <w:pPr>
+        <w:pStyle w:val="Heading2"/>
+      </w:pPr>
+      <w:r>
+        <w:t xml:space="preserve">6. Conclusion</w:t>
+      </w:r>
+    </w:p>
+    <w:p>
+      <w:pPr>
+        <w:pStyle w:val="FirstParagraph"/>
+      </w:pPr>
+      <w:r>
+        <w:t xml:space="preserve">Across 50 Asian and Pacific economies, barely half of formal-sector firms have crossed the most basic digital threshold, and the gap between the strongest and weakest institutional regimes is roughly 28 percentage points. The productivity dividend from closing that gap is real in every regime and largest in the catching-up economies that are mid-transition. Yet these economies — the ones with the most to gain from basic digitalisation — are the least equipped to absorb the AI tools now dominating the development conversation. The implication for the age of AI is direct: sustainable, broadly shared growth from AI presupposes a digital substrate that does not yet exist for half the region's firms. Closing the pre-AI digital divide is the precondition for AI to narrow rather than widen development inequality, and the firm-level evidence shows that closing it pays — most of all where the gap is widest.</w:t>
+      </w:r>
+    </w:p>
+    <w:p>
+      <w:pPr>
+        <w:pStyle w:val="BodyText"/>
+      </w:pPr>
+      <w:r>
+        <w:t xml:space="preserve">These conclusions invite three lines of further work. First, the binary web-presence indicator should be extended up the digital ladder: more recent WBES waves carry richer items — e-commerce, digital payments, and eventually AI-tool use — that would let the analysis trace the dividend from basic presence through to AI adoption itself, testing whether the saturation pattern recurs at each rung. Second, the associational design should be sharpened where instruments are available; staggered national broadband and digital-ID rollouts offer plausible sources of exogenous variation in firm digital adoption that a panel extension of the WBES could exploit. Third, the income-development axis should be made explicit by merging the firm-level adoption rates with national GNI and digital-infrastructure indicators (the replication script accompanying this paper performs the merge once networked access is available), allowing the divide to be priced against the macro development gradient rather than the institutional proxy used here. None of these extensions, however, overturns the core message: in an era preoccupied with the frontier, the binding development constraint for most firms remains the first digital step — and that step, the evidence shows, already pays.</w:t>
+      </w:r>
+    </w:p>
+    <w:bookmarkEnd w:id="44"/>
+    <w:bookmarkStart w:id="45" w:name="references"/>
+    <w:p>
+      <w:pPr>
+        <w:pStyle w:val="Heading2"/>
+      </w:pPr>
+      <w:r>
+        <w:t xml:space="preserve">References</w:t>
+      </w:r>
+    </w:p>
+    <w:p>
+      <w:pPr>
+        <w:pStyle w:val="FirstParagraph"/>
+      </w:pPr>
+      <w:r>
+        <w:t xml:space="preserve">Acemoglu, D., &amp; Restrepo, P. (2020). Robots and jobs: Evidence from US labor markets.</w:t>
       </w:r>
       <w:r>
         <w:t xml:space="preserve"> </w:t>
@@ -2191,18 +2286,18 @@
           <w:iCs/>
           <w:i/>
         </w:rPr>
-        <w:t xml:space="preserve">The economics of artificial intelligence: An agenda</w:t>
-      </w:r>
-      <w:r>
-        <w:t xml:space="preserve">. University of Chicago Press.</w:t>
-      </w:r>
-    </w:p>
-    <w:p>
-      <w:pPr>
-        <w:pStyle w:val="BodyText"/>
-      </w:pPr>
-      <w:r>
-        <w:t xml:space="preserve">Bloom, N., Garicano, L., Sadun, R., &amp; Van Reenen, J. (2014). The distinct effects of information technology and communication technology on firm organization.</w:t>
+        <w:t xml:space="preserve">Journal of Political Economy, 128</w:t>
+      </w:r>
+      <w:r>
+        <w:t xml:space="preserve">(6), 2188–2244.</w:t>
+      </w:r>
+    </w:p>
+    <w:p>
+      <w:pPr>
+        <w:pStyle w:val="BodyText"/>
+      </w:pPr>
+      <w:r>
+        <w:t xml:space="preserve">Agrawal, A., Gans, J., &amp; Goldfarb, A. (2019).</w:t>
       </w:r>
       <w:r>
         <w:t xml:space="preserve"> </w:t>
@@ -2212,18 +2307,18 @@
           <w:iCs/>
           <w:i/>
         </w:rPr>
-        <w:t xml:space="preserve">Management Science, 60</w:t>
-      </w:r>
-      <w:r>
-        <w:t xml:space="preserve">(12), 2859–2885.</w:t>
-      </w:r>
-    </w:p>
-    <w:p>
-      <w:pPr>
-        <w:pStyle w:val="BodyText"/>
-      </w:pPr>
-      <w:r>
-        <w:t xml:space="preserve">Bresnahan, T. F., &amp; Trajtenberg, M. (1995). General purpose technologies: "Engines of growth"?</w:t>
+        <w:t xml:space="preserve">The economics of artificial intelligence: An agenda</w:t>
+      </w:r>
+      <w:r>
+        <w:t xml:space="preserve">. University of Chicago Press.</w:t>
+      </w:r>
+    </w:p>
+    <w:p>
+      <w:pPr>
+        <w:pStyle w:val="BodyText"/>
+      </w:pPr>
+      <w:r>
+        <w:t xml:space="preserve">Bloom, N., Garicano, L., Sadun, R., &amp; Van Reenen, J. (2014). The distinct effects of information technology and communication technology on firm organization.</w:t>
       </w:r>
       <w:r>
         <w:t xml:space="preserve"> </w:t>
@@ -2233,18 +2328,18 @@
           <w:iCs/>
           <w:i/>
         </w:rPr>
-        <w:t xml:space="preserve">Journal of Econometrics, 65</w:t>
-      </w:r>
-      <w:r>
-        <w:t xml:space="preserve">(1), 83–108.</w:t>
-      </w:r>
-    </w:p>
-    <w:p>
-      <w:pPr>
-        <w:pStyle w:val="BodyText"/>
-      </w:pPr>
-      <w:r>
-        <w:t xml:space="preserve">Brynjolfsson, E., Rock, D., &amp; Syverson, C. (2021). The productivity J-curve: How intangibles complement general purpose technologies.</w:t>
+        <w:t xml:space="preserve">Management Science, 60</w:t>
+      </w:r>
+      <w:r>
+        <w:t xml:space="preserve">(12), 2859–2885.</w:t>
+      </w:r>
+    </w:p>
+    <w:p>
+      <w:pPr>
+        <w:pStyle w:val="BodyText"/>
+      </w:pPr>
+      <w:r>
+        <w:t xml:space="preserve">Bresnahan, T. F., &amp; Trajtenberg, M. (1995). General purpose technologies: "Engines of growth"?</w:t>
       </w:r>
       <w:r>
         <w:t xml:space="preserve"> </w:t>
@@ -2254,18 +2349,18 @@
           <w:iCs/>
           <w:i/>
         </w:rPr>
-        <w:t xml:space="preserve">American Economic Journal: Macroeconomics, 13</w:t>
-      </w:r>
-      <w:r>
-        <w:t xml:space="preserve">(1), 333–372.</w:t>
-      </w:r>
-    </w:p>
-    <w:p>
-      <w:pPr>
-        <w:pStyle w:val="BodyText"/>
-      </w:pPr>
-      <w:r>
-        <w:t xml:space="preserve">Cohen, W. M., &amp; Levinthal, D. A. (1990). Absorptive capacity: A new perspective on learning and innovation.</w:t>
+        <w:t xml:space="preserve">Journal of Econometrics, 65</w:t>
+      </w:r>
+      <w:r>
+        <w:t xml:space="preserve">(1), 83–108.</w:t>
+      </w:r>
+    </w:p>
+    <w:p>
+      <w:pPr>
+        <w:pStyle w:val="BodyText"/>
+      </w:pPr>
+      <w:r>
+        <w:t xml:space="preserve">Brynjolfsson, E., Rock, D., &amp; Syverson, C. (2021). The productivity J-curve: How intangibles complement general purpose technologies.</w:t>
       </w:r>
       <w:r>
         <w:t xml:space="preserve"> </w:t>
@@ -2275,18 +2370,18 @@
           <w:iCs/>
           <w:i/>
         </w:rPr>
-        <w:t xml:space="preserve">Administrative Science Quarterly, 35</w:t>
-      </w:r>
-      <w:r>
-        <w:t xml:space="preserve">(1), 128–152.</w:t>
-      </w:r>
-    </w:p>
-    <w:p>
-      <w:pPr>
-        <w:pStyle w:val="BodyText"/>
-      </w:pPr>
-      <w:r>
-        <w:t xml:space="preserve">Comin, D., &amp; Mestieri, M. (2018). If technology has arrived everywhere, why has income diverged?</w:t>
+        <w:t xml:space="preserve">American Economic Journal: Macroeconomics, 13</w:t>
+      </w:r>
+      <w:r>
+        <w:t xml:space="preserve">(1), 333–372.</w:t>
+      </w:r>
+    </w:p>
+    <w:p>
+      <w:pPr>
+        <w:pStyle w:val="BodyText"/>
+      </w:pPr>
+      <w:r>
+        <w:t xml:space="preserve">Cohen, W. M., &amp; Levinthal, D. A. (1990). Absorptive capacity: A new perspective on learning and innovation.</w:t>
       </w:r>
       <w:r>
         <w:t xml:space="preserve"> </w:t>
@@ -2296,18 +2391,18 @@
           <w:iCs/>
           <w:i/>
         </w:rPr>
-        <w:t xml:space="preserve">American Economic Journal: Macroeconomics, 10</w:t>
-      </w:r>
-      <w:r>
-        <w:t xml:space="preserve">(3), 137–178.</w:t>
-      </w:r>
-    </w:p>
-    <w:p>
-      <w:pPr>
-        <w:pStyle w:val="BodyText"/>
-      </w:pPr>
-      <w:r>
-        <w:t xml:space="preserve">Cusolito, A. P., &amp; Maloney, W. F. (2018).</w:t>
+        <w:t xml:space="preserve">Administrative Science Quarterly, 35</w:t>
+      </w:r>
+      <w:r>
+        <w:t xml:space="preserve">(1), 128–152.</w:t>
+      </w:r>
+    </w:p>
+    <w:p>
+      <w:pPr>
+        <w:pStyle w:val="BodyText"/>
+      </w:pPr>
+      <w:r>
+        <w:t xml:space="preserve">Comin, D., &amp; Mestieri, M. (2018). If technology has arrived everywhere, why has income diverged?</w:t>
       </w:r>
       <w:r>
         <w:t xml:space="preserve"> </w:t>
@@ -2317,18 +2412,18 @@
           <w:iCs/>
           <w:i/>
         </w:rPr>
-        <w:t xml:space="preserve">Productivity revisited: Shifting paradigms in analysis and policy</w:t>
-      </w:r>
-      <w:r>
-        <w:t xml:space="preserve">. World Bank.</w:t>
-      </w:r>
-    </w:p>
-    <w:p>
-      <w:pPr>
-        <w:pStyle w:val="BodyText"/>
-      </w:pPr>
-      <w:r>
-        <w:t xml:space="preserve">David, P. A. (1990). The dynamo and the computer: An historical perspective on the modern productivity paradox.</w:t>
+        <w:t xml:space="preserve">American Economic Journal: Macroeconomics, 10</w:t>
+      </w:r>
+      <w:r>
+        <w:t xml:space="preserve">(3), 137–178.</w:t>
+      </w:r>
+    </w:p>
+    <w:p>
+      <w:pPr>
+        <w:pStyle w:val="BodyText"/>
+      </w:pPr>
+      <w:r>
+        <w:t xml:space="preserve">Cusolito, A. P., &amp; Maloney, W. F. (2018).</w:t>
       </w:r>
       <w:r>
         <w:t xml:space="preserve"> </w:t>
@@ -2338,18 +2433,18 @@
           <w:iCs/>
           <w:i/>
         </w:rPr>
-        <w:t xml:space="preserve">American Economic Review, 80</w:t>
-      </w:r>
-      <w:r>
-        <w:t xml:space="preserve">(2), 355–361.</w:t>
-      </w:r>
-    </w:p>
-    <w:p>
-      <w:pPr>
-        <w:pStyle w:val="BodyText"/>
-      </w:pPr>
-      <w:r>
-        <w:t xml:space="preserve">Khanna, T., &amp; Palepu, K. G. (2010).</w:t>
+        <w:t xml:space="preserve">Productivity revisited: Shifting paradigms in analysis and policy</w:t>
+      </w:r>
+      <w:r>
+        <w:t xml:space="preserve">. World Bank.</w:t>
+      </w:r>
+    </w:p>
+    <w:p>
+      <w:pPr>
+        <w:pStyle w:val="BodyText"/>
+      </w:pPr>
+      <w:r>
+        <w:t xml:space="preserve">David, P. A. (1990). The dynamo and the computer: An historical perspective on the modern productivity paradox.</w:t>
       </w:r>
       <w:r>
         <w:t xml:space="preserve"> </w:t>
@@ -2359,26 +2454,18 @@
           <w:iCs/>
           <w:i/>
         </w:rPr>
-        <w:t xml:space="preserve">Winning in emerging markets: A road map for strategy and execution</w:t>
-      </w:r>
-      <w:r>
-        <w:t xml:space="preserve">. Harvard Business Press.</w:t>
-      </w:r>
-    </w:p>
-    <w:p>
-      <w:pPr>
-        <w:pStyle w:val="BodyText"/>
-      </w:pPr>
-      <w:r>
-        <w:t xml:space="preserve">Korinek, A., &amp; Stiglitz, J. E. (2021). Artificial intelligence, globalization, and strategies for economic development (NBER Working Paper No. 28453). National Bureau of Economic Research.</w:t>
-      </w:r>
-    </w:p>
-    <w:p>
-      <w:pPr>
-        <w:pStyle w:val="BodyText"/>
-      </w:pPr>
-      <w:r>
-        <w:t xml:space="preserve">Norris, P. (2001).</w:t>
+        <w:t xml:space="preserve">American Economic Review, 80</w:t>
+      </w:r>
+      <w:r>
+        <w:t xml:space="preserve">(2), 355–361.</w:t>
+      </w:r>
+    </w:p>
+    <w:p>
+      <w:pPr>
+        <w:pStyle w:val="BodyText"/>
+      </w:pPr>
+      <w:r>
+        <w:t xml:space="preserve">Khanna, T., &amp; Palepu, K. G. (2010).</w:t>
       </w:r>
       <w:r>
         <w:t xml:space="preserve"> </w:t>
@@ -2388,18 +2475,26 @@
           <w:iCs/>
           <w:i/>
         </w:rPr>
-        <w:t xml:space="preserve">Digital divide: Civic engagement, information poverty, and the Internet worldwide</w:t>
-      </w:r>
-      <w:r>
-        <w:t xml:space="preserve">. Cambridge University Press.</w:t>
-      </w:r>
-    </w:p>
-    <w:p>
-      <w:pPr>
-        <w:pStyle w:val="BodyText"/>
-      </w:pPr>
-      <w:r>
-        <w:t xml:space="preserve">North, D. C. (1990).</w:t>
+        <w:t xml:space="preserve">Winning in emerging markets: A road map for strategy and execution</w:t>
+      </w:r>
+      <w:r>
+        <w:t xml:space="preserve">. Harvard Business Press.</w:t>
+      </w:r>
+    </w:p>
+    <w:p>
+      <w:pPr>
+        <w:pStyle w:val="BodyText"/>
+      </w:pPr>
+      <w:r>
+        <w:t xml:space="preserve">Korinek, A., &amp; Stiglitz, J. E. (2021). Artificial intelligence, globalization, and strategies for economic development (NBER Working Paper No. 28453). National Bureau of Economic Research.</w:t>
+      </w:r>
+    </w:p>
+    <w:p>
+      <w:pPr>
+        <w:pStyle w:val="BodyText"/>
+      </w:pPr>
+      <w:r>
+        <w:t xml:space="preserve">Norris, P. (2001).</w:t>
       </w:r>
       <w:r>
         <w:t xml:space="preserve"> </w:t>
@@ -2409,7 +2504,7 @@
           <w:iCs/>
           <w:i/>
         </w:rPr>
-        <w:t xml:space="preserve">Institutions, institutional change and economic performance</w:t>
+        <w:t xml:space="preserve">Digital divide: Civic engagement, information poverty, and the Internet worldwide</w:t>
       </w:r>
       <w:r>
         <w:t xml:space="preserve">. Cambridge University Press.</w:t>
@@ -2420,7 +2515,7 @@
         <w:pStyle w:val="BodyText"/>
       </w:pPr>
       <w:r>
-        <w:t xml:space="preserve">OECD. (2001).</w:t>
+        <w:t xml:space="preserve">North, D. C. (1990).</w:t>
       </w:r>
       <w:r>
         <w:t xml:space="preserve"> </w:t>
@@ -2430,18 +2525,18 @@
           <w:iCs/>
           <w:i/>
         </w:rPr>
-        <w:t xml:space="preserve">Understanding the digital divide</w:t>
-      </w:r>
-      <w:r>
-        <w:t xml:space="preserve">. OECD Publishing.</w:t>
-      </w:r>
-    </w:p>
-    <w:p>
-      <w:pPr>
-        <w:pStyle w:val="BodyText"/>
-      </w:pPr>
-      <w:r>
-        <w:t xml:space="preserve">Verhoef, P. C., Broekhuizen, T., Bart, Y., Bhattacharya, A., Dong, J. Q., Fabian, N., &amp; Haenlein, M. (2021). Digital transformation: A multidisciplinary reflection and research agenda.</w:t>
+        <w:t xml:space="preserve">Institutions, institutional change and economic performance</w:t>
+      </w:r>
+      <w:r>
+        <w:t xml:space="preserve">. Cambridge University Press.</w:t>
+      </w:r>
+    </w:p>
+    <w:p>
+      <w:pPr>
+        <w:pStyle w:val="BodyText"/>
+      </w:pPr>
+      <w:r>
+        <w:t xml:space="preserve">OECD. (2001).</w:t>
       </w:r>
       <w:r>
         <w:t xml:space="preserve"> </w:t>
@@ -2451,18 +2546,18 @@
           <w:iCs/>
           <w:i/>
         </w:rPr>
-        <w:t xml:space="preserve">Journal of Business Research, 122</w:t>
-      </w:r>
-      <w:r>
-        <w:t xml:space="preserve">, 889–901.</w:t>
-      </w:r>
-    </w:p>
-    <w:p>
-      <w:pPr>
-        <w:pStyle w:val="BodyText"/>
-      </w:pPr>
-      <w:r>
-        <w:t xml:space="preserve">World Bank. (2026).</w:t>
+        <w:t xml:space="preserve">Understanding the digital divide</w:t>
+      </w:r>
+      <w:r>
+        <w:t xml:space="preserve">. OECD Publishing.</w:t>
+      </w:r>
+    </w:p>
+    <w:p>
+      <w:pPr>
+        <w:pStyle w:val="BodyText"/>
+      </w:pPr>
+      <w:r>
+        <w:t xml:space="preserve">Verhoef, P. C., Broekhuizen, T., Bart, Y., Bhattacharya, A., Dong, J. Q., Fabian, N., &amp; Haenlein, M. (2021). Digital transformation: A multidisciplinary reflection and research agenda.</w:t>
       </w:r>
       <w:r>
         <w:t xml:space="preserve"> </w:t>
@@ -2472,6 +2567,27 @@
           <w:iCs/>
           <w:i/>
         </w:rPr>
+        <w:t xml:space="preserve">Journal of Business Research, 122</w:t>
+      </w:r>
+      <w:r>
+        <w:t xml:space="preserve">, 889–901.</w:t>
+      </w:r>
+    </w:p>
+    <w:p>
+      <w:pPr>
+        <w:pStyle w:val="BodyText"/>
+      </w:pPr>
+      <w:r>
+        <w:t xml:space="preserve">World Bank. (2026).</w:t>
+      </w:r>
+      <w:r>
+        <w:t xml:space="preserve"> </w:t>
+      </w:r>
+      <w:r>
+        <w:rPr>
+          <w:iCs/>
+          <w:i/>
+        </w:rPr>
         <w:t xml:space="preserve">World Bank Enterprise Surveys</w:t>
       </w:r>
       <w:r>
@@ -2481,8 +2597,8 @@
         <w:t xml:space="preserve">[Data file]. World Bank.</w:t>
       </w:r>
     </w:p>
-    <w:bookmarkEnd w:id="43"/>
-    <w:bookmarkEnd w:id="44"/>
+    <w:bookmarkEnd w:id="45"/>
+    <w:bookmarkEnd w:id="46"/>
     <w:sectPr>
       <w:pgSz w:h="16838" w:w="11906"/>
       <w:pgMar w:bottom="1417" w:left="1417" w:right="1417" w:top="1417"/>

</xml_diff>